<commit_message>
Redesign com a marca do website (gradiente, Poppins, pilula), Spinner nativo, APK release assinado e Gradle 9.3.1
</commit_message>
<xml_diff>
--- a/docs/Relatorio-Tecnico.docx
+++ b/docs/Relatorio-Tecnico.docx
@@ -19,7 +19,7 @@
     <w:p>
       <w:pPr>
         <w:shd w:val="clear" w:color="auto" w:fill="F5F5F5"/>
-        <w:divId w:val="907230974"/>
+        <w:divId w:val="1006519367"/>
         <w:rPr>
           <w:rFonts w:ascii="Segoe UI" w:eastAsia="Times New Roman" w:hAnsi="Segoe UI" w:cs="Segoe UI"/>
           <w:color w:val="222222"/>
@@ -3251,7 +3251,6 @@
         <w:rPr>
           <w:rFonts w:ascii="Segoe UI" w:eastAsia="Times New Roman" w:hAnsi="Segoe UI" w:cs="Segoe UI"/>
         </w:rPr>
-        <w:lastRenderedPageBreak/>
         <w:t>5. Tratamento de erros</w:t>
       </w:r>
     </w:p>
@@ -4092,7 +4091,6 @@
           <w:sz w:val="22"/>
           <w:szCs w:val="22"/>
         </w:rPr>
-        <w:lastRenderedPageBreak/>
         <w:t>Percorri todos os fluxos no emulador: entrar → projetos → quadro → detalhe → membros → relatório → voltar, confirmando que o botão voltar do sistema volta sempre ao ecrã anterior. A app arranca e funciona corretamente em Android 15 (emulador, API 35).</w:t>
       </w:r>
     </w:p>
@@ -5002,7 +5000,6 @@
           <w:sz w:val="22"/>
           <w:szCs w:val="22"/>
         </w:rPr>
-        <w:lastRenderedPageBreak/>
         <w:t>Política de privacidade:</w:t>
       </w:r>
       <w:r>
@@ -5248,7 +5245,274 @@
           <w:rFonts w:ascii="Segoe UI" w:eastAsia="Times New Roman" w:hAnsi="Segoe UI" w:cs="Segoe UI"/>
           <w:color w:val="222222"/>
         </w:rPr>
-        <w:t>7.3 Bibliotecas, licenças e créditos</w:t>
+        <w:t>7.3 Assinatura e publicação</w:t>
+      </w:r>
+    </w:p>
+    <w:p>
+      <w:pPr>
+        <w:numPr>
+          <w:ilvl w:val="0"/>
+          <w:numId w:val="2"/>
+        </w:numPr>
+        <w:spacing w:before="100" w:beforeAutospacing="1" w:after="60"/>
+        <w:rPr>
+          <w:rFonts w:ascii="Segoe UI" w:eastAsia="Times New Roman" w:hAnsi="Segoe UI" w:cs="Segoe UI"/>
+          <w:color w:val="222222"/>
+          <w:sz w:val="22"/>
+          <w:szCs w:val="22"/>
+        </w:rPr>
+      </w:pPr>
+      <w:r>
+        <w:rPr>
+          <w:rStyle w:val="Forte"/>
+          <w:rFonts w:ascii="Segoe UI" w:eastAsia="Times New Roman" w:hAnsi="Segoe UI" w:cs="Segoe UI"/>
+          <w:color w:val="222222"/>
+          <w:sz w:val="22"/>
+          <w:szCs w:val="22"/>
+        </w:rPr>
+        <w:t>Keystore de release:</w:t>
+      </w:r>
+      <w:r>
+        <w:rPr>
+          <w:rFonts w:ascii="Segoe UI" w:eastAsia="Times New Roman" w:hAnsi="Segoe UI" w:cs="Segoe UI"/>
+          <w:color w:val="222222"/>
+          <w:sz w:val="22"/>
+          <w:szCs w:val="22"/>
+        </w:rPr>
+        <w:t xml:space="preserve"> foi criada a chave de assinatura </w:t>
+      </w:r>
+      <w:r>
+        <w:rPr>
+          <w:rStyle w:val="CdigoHTML"/>
+          <w:color w:val="222222"/>
+        </w:rPr>
+        <w:t>taskflow-release.jks</w:t>
+      </w:r>
+      <w:r>
+        <w:rPr>
+          <w:rFonts w:ascii="Segoe UI" w:eastAsia="Times New Roman" w:hAnsi="Segoe UI" w:cs="Segoe UI"/>
+          <w:color w:val="222222"/>
+          <w:sz w:val="22"/>
+          <w:szCs w:val="22"/>
+        </w:rPr>
+        <w:t xml:space="preserve"> (RSA 2048, validade 10.000 dias, titular Bruno Castro / algarIT, Faro). Por segurança, o ficheiro da keystore e as palavras-passe ficam </w:t>
+      </w:r>
+      <w:r>
+        <w:rPr>
+          <w:rStyle w:val="Forte"/>
+          <w:rFonts w:ascii="Segoe UI" w:eastAsia="Times New Roman" w:hAnsi="Segoe UI" w:cs="Segoe UI"/>
+          <w:color w:val="222222"/>
+          <w:sz w:val="22"/>
+          <w:szCs w:val="22"/>
+        </w:rPr>
+        <w:t>fora do repositório</w:t>
+      </w:r>
+      <w:r>
+        <w:rPr>
+          <w:rFonts w:ascii="Segoe UI" w:eastAsia="Times New Roman" w:hAnsi="Segoe UI" w:cs="Segoe UI"/>
+          <w:color w:val="222222"/>
+          <w:sz w:val="22"/>
+          <w:szCs w:val="22"/>
+        </w:rPr>
+        <w:t xml:space="preserve"> (no .gitignore).</w:t>
+      </w:r>
+    </w:p>
+    <w:p>
+      <w:pPr>
+        <w:numPr>
+          <w:ilvl w:val="0"/>
+          <w:numId w:val="2"/>
+        </w:numPr>
+        <w:spacing w:before="100" w:beforeAutospacing="1" w:after="60"/>
+        <w:rPr>
+          <w:rFonts w:ascii="Segoe UI" w:eastAsia="Times New Roman" w:hAnsi="Segoe UI" w:cs="Segoe UI"/>
+          <w:color w:val="222222"/>
+          <w:sz w:val="22"/>
+          <w:szCs w:val="22"/>
+        </w:rPr>
+      </w:pPr>
+      <w:r>
+        <w:rPr>
+          <w:rStyle w:val="Forte"/>
+          <w:rFonts w:ascii="Segoe UI" w:eastAsia="Times New Roman" w:hAnsi="Segoe UI" w:cs="Segoe UI"/>
+          <w:color w:val="222222"/>
+          <w:sz w:val="22"/>
+          <w:szCs w:val="22"/>
+        </w:rPr>
+        <w:t>APK de release assinado:</w:t>
+      </w:r>
+      <w:r>
+        <w:rPr>
+          <w:rFonts w:ascii="Segoe UI" w:eastAsia="Times New Roman" w:hAnsi="Segoe UI" w:cs="Segoe UI"/>
+          <w:color w:val="222222"/>
+          <w:sz w:val="22"/>
+          <w:szCs w:val="22"/>
+        </w:rPr>
+        <w:t xml:space="preserve"> gerado com </w:t>
+      </w:r>
+      <w:r>
+        <w:rPr>
+          <w:rStyle w:val="CdigoHTML"/>
+          <w:color w:val="222222"/>
+        </w:rPr>
+        <w:t>gradlew assembleRelease</w:t>
+      </w:r>
+      <w:r>
+        <w:rPr>
+          <w:rFonts w:ascii="Segoe UI" w:eastAsia="Times New Roman" w:hAnsi="Segoe UI" w:cs="Segoe UI"/>
+          <w:color w:val="222222"/>
+          <w:sz w:val="22"/>
+          <w:szCs w:val="22"/>
+        </w:rPr>
+        <w:t xml:space="preserve"> e verificado com a ferramenta </w:t>
+      </w:r>
+      <w:r>
+        <w:rPr>
+          <w:rStyle w:val="CdigoHTML"/>
+          <w:color w:val="222222"/>
+        </w:rPr>
+        <w:t>apksigner</w:t>
+      </w:r>
+      <w:r>
+        <w:rPr>
+          <w:rFonts w:ascii="Segoe UI" w:eastAsia="Times New Roman" w:hAnsi="Segoe UI" w:cs="Segoe UI"/>
+          <w:color w:val="222222"/>
+          <w:sz w:val="22"/>
+          <w:szCs w:val="22"/>
+        </w:rPr>
+        <w:t xml:space="preserve"> do SDK (certificado SHA-256 confirmado). A app instala-se neste APK em qualquer dispositivo.</w:t>
+      </w:r>
+    </w:p>
+    <w:p>
+      <w:pPr>
+        <w:numPr>
+          <w:ilvl w:val="0"/>
+          <w:numId w:val="2"/>
+        </w:numPr>
+        <w:spacing w:before="100" w:beforeAutospacing="1" w:after="60"/>
+        <w:rPr>
+          <w:rFonts w:ascii="Segoe UI" w:eastAsia="Times New Roman" w:hAnsi="Segoe UI" w:cs="Segoe UI"/>
+          <w:color w:val="222222"/>
+          <w:sz w:val="22"/>
+          <w:szCs w:val="22"/>
+        </w:rPr>
+      </w:pPr>
+      <w:r>
+        <w:rPr>
+          <w:rStyle w:val="Forte"/>
+          <w:rFonts w:ascii="Segoe UI" w:eastAsia="Times New Roman" w:hAnsi="Segoe UI" w:cs="Segoe UI"/>
+          <w:color w:val="222222"/>
+          <w:sz w:val="22"/>
+          <w:szCs w:val="22"/>
+        </w:rPr>
+        <w:t>Para publicar na Google Play:</w:t>
+      </w:r>
+      <w:r>
+        <w:rPr>
+          <w:rFonts w:ascii="Segoe UI" w:eastAsia="Times New Roman" w:hAnsi="Segoe UI" w:cs="Segoe UI"/>
+          <w:color w:val="222222"/>
+          <w:sz w:val="22"/>
+          <w:szCs w:val="22"/>
+        </w:rPr>
+        <w:t xml:space="preserve"> gerar o Android App Bundle (</w:t>
+      </w:r>
+      <w:r>
+        <w:rPr>
+          <w:rStyle w:val="CdigoHTML"/>
+          <w:color w:val="222222"/>
+        </w:rPr>
+        <w:t>gradlew bundleRelease</w:t>
+      </w:r>
+      <w:r>
+        <w:rPr>
+          <w:rFonts w:ascii="Segoe UI" w:eastAsia="Times New Roman" w:hAnsi="Segoe UI" w:cs="Segoe UI"/>
+          <w:color w:val="222222"/>
+          <w:sz w:val="22"/>
+          <w:szCs w:val="22"/>
+        </w:rPr>
+        <w:t>), criar a ficha da app na Play Console, carregar o AAB na faixa de testes interno, completar a secção de dadosafety/política de privacidade e só depois promover para produção. O mesmo keystore tem de ser usado em todas as atualizações futuras.</w:t>
+      </w:r>
+    </w:p>
+    <w:p>
+      <w:pPr>
+        <w:numPr>
+          <w:ilvl w:val="0"/>
+          <w:numId w:val="2"/>
+        </w:numPr>
+        <w:spacing w:before="100" w:beforeAutospacing="1" w:after="60"/>
+        <w:rPr>
+          <w:rFonts w:ascii="Segoe UI" w:eastAsia="Times New Roman" w:hAnsi="Segoe UI" w:cs="Segoe UI"/>
+          <w:color w:val="222222"/>
+          <w:sz w:val="22"/>
+          <w:szCs w:val="22"/>
+        </w:rPr>
+      </w:pPr>
+      <w:r>
+        <w:rPr>
+          <w:rStyle w:val="Forte"/>
+          <w:rFonts w:ascii="Segoe UI" w:eastAsia="Times New Roman" w:hAnsi="Segoe UI" w:cs="Segoe UI"/>
+          <w:color w:val="222222"/>
+          <w:sz w:val="22"/>
+          <w:szCs w:val="22"/>
+        </w:rPr>
+        <w:t>Versões geradas neste projeto:</w:t>
+      </w:r>
+      <w:r>
+        <w:rPr>
+          <w:rFonts w:ascii="Segoe UI" w:eastAsia="Times New Roman" w:hAnsi="Segoe UI" w:cs="Segoe UI"/>
+          <w:color w:val="222222"/>
+          <w:sz w:val="22"/>
+          <w:szCs w:val="22"/>
+        </w:rPr>
+        <w:t xml:space="preserve"> </w:t>
+      </w:r>
+      <w:r>
+        <w:rPr>
+          <w:rStyle w:val="CdigoHTML"/>
+          <w:color w:val="222222"/>
+        </w:rPr>
+        <w:t>app-debug.apk</w:t>
+      </w:r>
+      <w:r>
+        <w:rPr>
+          <w:rFonts w:ascii="Segoe UI" w:eastAsia="Times New Roman" w:hAnsi="Segoe UI" w:cs="Segoe UI"/>
+          <w:color w:val="222222"/>
+          <w:sz w:val="22"/>
+          <w:szCs w:val="22"/>
+        </w:rPr>
+        <w:t xml:space="preserve"> (testes) e </w:t>
+      </w:r>
+      <w:r>
+        <w:rPr>
+          <w:rStyle w:val="CdigoHTML"/>
+          <w:color w:val="222222"/>
+        </w:rPr>
+        <w:t>app-release.apk</w:t>
+      </w:r>
+      <w:r>
+        <w:rPr>
+          <w:rFonts w:ascii="Segoe UI" w:eastAsia="Times New Roman" w:hAnsi="Segoe UI" w:cs="Segoe UI"/>
+          <w:color w:val="222222"/>
+          <w:sz w:val="22"/>
+          <w:szCs w:val="22"/>
+        </w:rPr>
+        <w:t xml:space="preserve"> (assinado, para distribuição direta).</w:t>
+      </w:r>
+    </w:p>
+    <w:p>
+      <w:pPr>
+        <w:pStyle w:val="Ttulo3"/>
+        <w:rPr>
+          <w:rFonts w:ascii="Segoe UI" w:eastAsia="Times New Roman" w:hAnsi="Segoe UI" w:cs="Segoe UI"/>
+          <w:color w:val="222222"/>
+        </w:rPr>
+      </w:pPr>
+      <w:r>
+        <w:rPr>
+          <w:rFonts w:ascii="Segoe UI" w:eastAsia="Times New Roman" w:hAnsi="Segoe UI" w:cs="Segoe UI"/>
+          <w:color w:val="222222"/>
+        </w:rPr>
+        <w:t>7.4 Bibliotecas, licenças e créditos</w:t>
       </w:r>
     </w:p>
     <w:tbl>
@@ -6339,16 +6603,7 @@
           <w:sz w:val="22"/>
           <w:szCs w:val="22"/>
         </w:rPr>
-        <w:t xml:space="preserve"> </w:t>
-      </w:r>
-      <w:r>
-        <w:rPr>
-          <w:rFonts w:ascii="Segoe UI" w:hAnsi="Segoe UI" w:cs="Segoe UI"/>
-          <w:color w:val="222222"/>
-          <w:sz w:val="22"/>
-          <w:szCs w:val="22"/>
-        </w:rPr>
-        <w:t>API, ícones e imagens são próprios (o ícone da app é vetorial, desenhado para o projeto). Não são usadas imagens de terceiros. Fonte: tipo de sistema.</w:t>
+        <w:t xml:space="preserve"> API, ícones e imagens são próprios (o ícone da app é vetorial, desenhado para o projeto). Não são usadas imagens de terceiros. Fonte: tipo de sistema.</w:t>
       </w:r>
     </w:p>
     <w:p>
@@ -6419,7 +6674,7 @@
       <w:pPr>
         <w:numPr>
           <w:ilvl w:val="0"/>
-          <w:numId w:val="2"/>
+          <w:numId w:val="3"/>
         </w:numPr>
         <w:spacing w:before="100" w:beforeAutospacing="1" w:after="60"/>
         <w:rPr>
@@ -6443,7 +6698,7 @@
       <w:pPr>
         <w:numPr>
           <w:ilvl w:val="0"/>
-          <w:numId w:val="2"/>
+          <w:numId w:val="3"/>
         </w:numPr>
         <w:spacing w:before="100" w:beforeAutospacing="1" w:after="60"/>
         <w:rPr>
@@ -6467,7 +6722,7 @@
       <w:pPr>
         <w:numPr>
           <w:ilvl w:val="0"/>
-          <w:numId w:val="2"/>
+          <w:numId w:val="3"/>
         </w:numPr>
         <w:spacing w:before="100" w:beforeAutospacing="1" w:after="60"/>
         <w:rPr>
@@ -6491,7 +6746,7 @@
       <w:pPr>
         <w:numPr>
           <w:ilvl w:val="0"/>
-          <w:numId w:val="2"/>
+          <w:numId w:val="3"/>
         </w:numPr>
         <w:spacing w:before="100" w:beforeAutospacing="1" w:after="60"/>
         <w:rPr>
@@ -6556,9 +6811,9 @@
 <file path=word/numbering.xml><?xml version="1.0" encoding="utf-8"?>
 <w:numbering xmlns:wpc="http://schemas.microsoft.com/office/word/2010/wordprocessingCanvas" xmlns:cx="http://schemas.microsoft.com/office/drawing/2014/chartex" xmlns:cx1="http://schemas.microsoft.com/office/drawing/2015/9/8/chartex" xmlns:cx2="http://schemas.microsoft.com/office/drawing/2015/10/21/chartex" xmlns:cx3="http://schemas.microsoft.com/office/drawing/2016/5/9/chartex" xmlns:cx4="http://schemas.microsoft.com/office/drawing/2016/5/10/chartex" xmlns:cx5="http://schemas.microsoft.com/office/drawing/2016/5/11/chartex" xmlns:cx6="http://schemas.microsoft.com/office/drawing/2016/5/12/chartex" xmlns:cx7="http://schemas.microsoft.com/office/drawing/2016/5/13/chartex" xmlns:cx8="http://schemas.microsoft.com/office/drawing/2016/5/14/chartex" xmlns:mc="http://schemas.openxmlformats.org/markup-compatibility/2006" xmlns:aink="http://schemas.microsoft.com/office/drawing/2016/ink" xmlns:am3d="http://schemas.microsoft.com/office/drawing/2017/model3d" xmlns:o="urn:schemas-microsoft-com:office:office" xmlns:oel="http://schemas.microsoft.com/office/2019/extlst" xmlns:r="http://schemas.openxmlformats.org/officeDocument/2006/relationships" xmlns:m="http://schemas.openxmlformats.org/officeDocument/2006/math" xmlns:v="urn:schemas-microsoft-com:vml" xmlns:wp14="http://schemas.microsoft.com/office/word/2010/wordprocessingDrawing" xmlns:wp="http://schemas.openxmlformats.org/drawingml/2006/wordprocessingDrawing" xmlns:w10="urn:schemas-microsoft-com:office:word" xmlns:w="http://schemas.openxmlformats.org/wordprocessingml/2006/main" xmlns:w14="http://schemas.microsoft.com/office/word/2010/wordml" xmlns:w15="http://schemas.microsoft.com/office/word/2012/wordml" xmlns:w16cex="http://schemas.microsoft.com/office/word/2018/wordml/cex" xmlns:w16cid="http://schemas.microsoft.com/office/word/2016/wordml/cid" xmlns:w16="http://schemas.microsoft.com/office/word/2018/wordml" xmlns:w16sdtdh="http://schemas.microsoft.com/office/word/2020/wordml/sdtdatahash" xmlns:w16se="http://schemas.microsoft.com/office/word/2015/wordml/symex" xmlns:wpg="http://schemas.microsoft.com/office/word/2010/wordprocessingGroup" xmlns:wpi="http://schemas.microsoft.com/office/word/2010/wordprocessingInk" xmlns:wne="http://schemas.microsoft.com/office/word/2006/wordml" xmlns:wps="http://schemas.microsoft.com/office/word/2010/wordprocessingShape" mc:Ignorable="w14 w15 w16se w16cid w16 w16cex w16sdtdh wp14">
   <w:abstractNum w:abstractNumId="0" w15:restartNumberingAfterBreak="0">
-    <w:nsid w:val="22EA2FEF"/>
+    <w:nsid w:val="070A3832"/>
     <w:multiLevelType w:val="multilevel"/>
-    <w:tmpl w:val="2D44D2EA"/>
+    <w:tmpl w:val="4B325440"/>
     <w:lvl w:ilvl="0">
       <w:start w:val="1"/>
       <w:numFmt w:val="bullet"/>
@@ -6705,9 +6960,158 @@
     </w:lvl>
   </w:abstractNum>
   <w:abstractNum w:abstractNumId="1" w15:restartNumberingAfterBreak="0">
-    <w:nsid w:val="59985430"/>
+    <w:nsid w:val="37491A6B"/>
     <w:multiLevelType w:val="multilevel"/>
-    <w:tmpl w:val="FAC647AA"/>
+    <w:tmpl w:val="77649DD8"/>
+    <w:lvl w:ilvl="0">
+      <w:start w:val="1"/>
+      <w:numFmt w:val="bullet"/>
+      <w:lvlText w:val=""/>
+      <w:lvlJc w:val="left"/>
+      <w:pPr>
+        <w:tabs>
+          <w:tab w:val="num" w:pos="720"/>
+        </w:tabs>
+        <w:ind w:left="720" w:hanging="360"/>
+      </w:pPr>
+      <w:rPr>
+        <w:rFonts w:ascii="Symbol" w:hAnsi="Symbol" w:hint="default"/>
+        <w:sz w:val="20"/>
+      </w:rPr>
+    </w:lvl>
+    <w:lvl w:ilvl="1" w:tentative="1">
+      <w:start w:val="1"/>
+      <w:numFmt w:val="bullet"/>
+      <w:lvlText w:val="o"/>
+      <w:lvlJc w:val="left"/>
+      <w:pPr>
+        <w:tabs>
+          <w:tab w:val="num" w:pos="1440"/>
+        </w:tabs>
+        <w:ind w:left="1440" w:hanging="360"/>
+      </w:pPr>
+      <w:rPr>
+        <w:rFonts w:ascii="Courier New" w:hAnsi="Courier New" w:hint="default"/>
+        <w:sz w:val="20"/>
+      </w:rPr>
+    </w:lvl>
+    <w:lvl w:ilvl="2" w:tentative="1">
+      <w:start w:val="1"/>
+      <w:numFmt w:val="bullet"/>
+      <w:lvlText w:val=""/>
+      <w:lvlJc w:val="left"/>
+      <w:pPr>
+        <w:tabs>
+          <w:tab w:val="num" w:pos="2160"/>
+        </w:tabs>
+        <w:ind w:left="2160" w:hanging="360"/>
+      </w:pPr>
+      <w:rPr>
+        <w:rFonts w:ascii="Wingdings" w:hAnsi="Wingdings" w:hint="default"/>
+        <w:sz w:val="20"/>
+      </w:rPr>
+    </w:lvl>
+    <w:lvl w:ilvl="3" w:tentative="1">
+      <w:start w:val="1"/>
+      <w:numFmt w:val="bullet"/>
+      <w:lvlText w:val=""/>
+      <w:lvlJc w:val="left"/>
+      <w:pPr>
+        <w:tabs>
+          <w:tab w:val="num" w:pos="2880"/>
+        </w:tabs>
+        <w:ind w:left="2880" w:hanging="360"/>
+      </w:pPr>
+      <w:rPr>
+        <w:rFonts w:ascii="Wingdings" w:hAnsi="Wingdings" w:hint="default"/>
+        <w:sz w:val="20"/>
+      </w:rPr>
+    </w:lvl>
+    <w:lvl w:ilvl="4" w:tentative="1">
+      <w:start w:val="1"/>
+      <w:numFmt w:val="bullet"/>
+      <w:lvlText w:val=""/>
+      <w:lvlJc w:val="left"/>
+      <w:pPr>
+        <w:tabs>
+          <w:tab w:val="num" w:pos="3600"/>
+        </w:tabs>
+        <w:ind w:left="3600" w:hanging="360"/>
+      </w:pPr>
+      <w:rPr>
+        <w:rFonts w:ascii="Wingdings" w:hAnsi="Wingdings" w:hint="default"/>
+        <w:sz w:val="20"/>
+      </w:rPr>
+    </w:lvl>
+    <w:lvl w:ilvl="5" w:tentative="1">
+      <w:start w:val="1"/>
+      <w:numFmt w:val="bullet"/>
+      <w:lvlText w:val=""/>
+      <w:lvlJc w:val="left"/>
+      <w:pPr>
+        <w:tabs>
+          <w:tab w:val="num" w:pos="4320"/>
+        </w:tabs>
+        <w:ind w:left="4320" w:hanging="360"/>
+      </w:pPr>
+      <w:rPr>
+        <w:rFonts w:ascii="Wingdings" w:hAnsi="Wingdings" w:hint="default"/>
+        <w:sz w:val="20"/>
+      </w:rPr>
+    </w:lvl>
+    <w:lvl w:ilvl="6" w:tentative="1">
+      <w:start w:val="1"/>
+      <w:numFmt w:val="bullet"/>
+      <w:lvlText w:val=""/>
+      <w:lvlJc w:val="left"/>
+      <w:pPr>
+        <w:tabs>
+          <w:tab w:val="num" w:pos="5040"/>
+        </w:tabs>
+        <w:ind w:left="5040" w:hanging="360"/>
+      </w:pPr>
+      <w:rPr>
+        <w:rFonts w:ascii="Wingdings" w:hAnsi="Wingdings" w:hint="default"/>
+        <w:sz w:val="20"/>
+      </w:rPr>
+    </w:lvl>
+    <w:lvl w:ilvl="7" w:tentative="1">
+      <w:start w:val="1"/>
+      <w:numFmt w:val="bullet"/>
+      <w:lvlText w:val=""/>
+      <w:lvlJc w:val="left"/>
+      <w:pPr>
+        <w:tabs>
+          <w:tab w:val="num" w:pos="5760"/>
+        </w:tabs>
+        <w:ind w:left="5760" w:hanging="360"/>
+      </w:pPr>
+      <w:rPr>
+        <w:rFonts w:ascii="Wingdings" w:hAnsi="Wingdings" w:hint="default"/>
+        <w:sz w:val="20"/>
+      </w:rPr>
+    </w:lvl>
+    <w:lvl w:ilvl="8" w:tentative="1">
+      <w:start w:val="1"/>
+      <w:numFmt w:val="bullet"/>
+      <w:lvlText w:val=""/>
+      <w:lvlJc w:val="left"/>
+      <w:pPr>
+        <w:tabs>
+          <w:tab w:val="num" w:pos="6480"/>
+        </w:tabs>
+        <w:ind w:left="6480" w:hanging="360"/>
+      </w:pPr>
+      <w:rPr>
+        <w:rFonts w:ascii="Wingdings" w:hAnsi="Wingdings" w:hint="default"/>
+        <w:sz w:val="20"/>
+      </w:rPr>
+    </w:lvl>
+  </w:abstractNum>
+  <w:abstractNum w:abstractNumId="2" w15:restartNumberingAfterBreak="0">
+    <w:nsid w:val="4BB11B00"/>
+    <w:multiLevelType w:val="multilevel"/>
+    <w:tmpl w:val="2C263392"/>
     <w:lvl w:ilvl="0">
       <w:start w:val="1"/>
       <w:numFmt w:val="decimal"/>
@@ -6817,11 +7221,14 @@
       </w:pPr>
     </w:lvl>
   </w:abstractNum>
-  <w:num w:numId="1" w16cid:durableId="1976183554">
+  <w:num w:numId="1" w16cid:durableId="1299527548">
     <w:abstractNumId w:val="0"/>
   </w:num>
-  <w:num w:numId="2" w16cid:durableId="1482112756">
+  <w:num w:numId="2" w16cid:durableId="2141609591">
     <w:abstractNumId w:val="1"/>
+  </w:num>
+  <w:num w:numId="3" w16cid:durableId="1956249863">
+    <w:abstractNumId w:val="2"/>
   </w:num>
 </w:numbering>
 </file>

</xml_diff>